<commit_message>
Se me olvido guardar los apuntes
</commit_message>
<xml_diff>
--- a/1er trimestre/UD1_Introduccion_HTML_y_CSS/Apuntes/Apuntes_Introduccion_a_HTML.docx
+++ b/1er trimestre/UD1_Introduccion_HTML_y_CSS/Apuntes/Apuntes_Introduccion_a_HTML.docx
@@ -1141,8 +1141,10 @@
           <w:szCs w:val="32"/>
         </w:rPr>
         <w:tab/>
-        <w:t xml:space="preserve">     </w:t>
-      </w:r>
+        <w:t xml:space="preserve">    </w:t>
+      </w:r>
+      <w:bookmarkStart w:id="0" w:name="_GoBack"/>
+      <w:bookmarkEnd w:id="0"/>
       <w:r>
         <w:rPr>
           <w:szCs w:val="32"/>
@@ -1171,7 +1173,6 @@
         <w:t>charset</w:t>
       </w:r>
       <w:proofErr w:type="spellEnd"/>
-      <w:proofErr w:type="gramStart"/>
       <w:r>
         <w:rPr>
           <w:color w:val="FF0000"/>
@@ -1184,15 +1185,7 @@
           <w:color w:val="FF0000"/>
           <w:szCs w:val="32"/>
         </w:rPr>
-        <w:t>UTF</w:t>
-      </w:r>
-      <w:proofErr w:type="gramEnd"/>
-      <w:r>
-        <w:rPr>
-          <w:color w:val="FF0000"/>
-          <w:szCs w:val="32"/>
-        </w:rPr>
-        <w:t>-8</w:t>
+        <w:t>UTF-8</w:t>
       </w:r>
       <w:r>
         <w:rPr>
@@ -2677,16 +2670,7 @@
           <w:color w:val="4472C4" w:themeColor="accent1"/>
           <w:szCs w:val="32"/>
         </w:rPr>
-        <w:t>*HTML es un lenguaje orientado a la estructura y semántica del documento, NO A SU PRESENTACIÓN. El aspecto d</w:t>
-      </w:r>
-      <w:bookmarkStart w:id="0" w:name="_GoBack"/>
-      <w:bookmarkEnd w:id="0"/>
-      <w:r>
-        <w:rPr>
-          <w:color w:val="4472C4" w:themeColor="accent1"/>
-          <w:szCs w:val="32"/>
-        </w:rPr>
-        <w:t>e un documento debe manipularse con CSS</w:t>
+        <w:t>*HTML es un lenguaje orientado a la estructura y semántica del documento, NO A SU PRESENTACIÓN. El aspecto de un documento debe manipularse con CSS</w:t>
       </w:r>
     </w:p>
     <w:p>
@@ -2789,6 +2773,341 @@
         <w:tab/>
         <w:t>| -&gt; Hacen lo mismo</w:t>
       </w:r>
+    </w:p>
+    <w:p>
+      <w:pPr>
+        <w:tabs>
+          <w:tab w:val="left" w:pos="1260"/>
+        </w:tabs>
+        <w:rPr>
+          <w:szCs w:val="32"/>
+        </w:rPr>
+      </w:pPr>
+      <w:r>
+        <w:rPr>
+          <w:color w:val="FF0000"/>
+          <w:szCs w:val="32"/>
+        </w:rPr>
+        <w:t>&lt;</w:t>
+      </w:r>
+      <w:proofErr w:type="spellStart"/>
+      <w:r>
+        <w:rPr>
+          <w:color w:val="FF0000"/>
+          <w:szCs w:val="32"/>
+        </w:rPr>
+        <w:t>br</w:t>
+      </w:r>
+      <w:proofErr w:type="spellEnd"/>
+      <w:r>
+        <w:rPr>
+          <w:color w:val="FF0000"/>
+          <w:szCs w:val="32"/>
+        </w:rPr>
+        <w:t xml:space="preserve">&gt; </w:t>
+      </w:r>
+      <w:r>
+        <w:rPr>
+          <w:szCs w:val="32"/>
+        </w:rPr>
+        <w:t>Marca un salto de línea, se puede escribir como &lt;</w:t>
+      </w:r>
+      <w:proofErr w:type="spellStart"/>
+      <w:r>
+        <w:rPr>
+          <w:szCs w:val="32"/>
+        </w:rPr>
+        <w:t>br</w:t>
+      </w:r>
+      <w:proofErr w:type="spellEnd"/>
+      <w:r>
+        <w:rPr>
+          <w:szCs w:val="32"/>
+        </w:rPr>
+        <w:t>&gt;, &lt;</w:t>
+      </w:r>
+      <w:proofErr w:type="spellStart"/>
+      <w:r>
+        <w:rPr>
+          <w:szCs w:val="32"/>
+        </w:rPr>
+        <w:t>br</w:t>
+      </w:r>
+      <w:proofErr w:type="spellEnd"/>
+      <w:r>
+        <w:rPr>
+          <w:szCs w:val="32"/>
+        </w:rPr>
+        <w:t>/&gt; o &lt;</w:t>
+      </w:r>
+      <w:proofErr w:type="spellStart"/>
+      <w:r>
+        <w:rPr>
+          <w:szCs w:val="32"/>
+        </w:rPr>
+        <w:t>br</w:t>
+      </w:r>
+      <w:proofErr w:type="spellEnd"/>
+      <w:r>
+        <w:rPr>
+          <w:szCs w:val="32"/>
+        </w:rPr>
+        <w:t>&gt;&lt;</w:t>
+      </w:r>
+      <w:r>
+        <w:rPr>
+          <w:szCs w:val="32"/>
+        </w:rPr>
+        <w:t>/</w:t>
+      </w:r>
+      <w:proofErr w:type="spellStart"/>
+      <w:r>
+        <w:rPr>
+          <w:szCs w:val="32"/>
+        </w:rPr>
+        <w:t>br</w:t>
+      </w:r>
+      <w:proofErr w:type="spellEnd"/>
+      <w:r>
+        <w:rPr>
+          <w:szCs w:val="32"/>
+        </w:rPr>
+        <w:t>&gt;</w:t>
+      </w:r>
+      <w:r>
+        <w:rPr>
+          <w:szCs w:val="32"/>
+        </w:rPr>
+        <w:t xml:space="preserve"> y no &lt;/</w:t>
+      </w:r>
+      <w:proofErr w:type="spellStart"/>
+      <w:r>
+        <w:rPr>
+          <w:szCs w:val="32"/>
+        </w:rPr>
+        <w:t>br</w:t>
+      </w:r>
+      <w:proofErr w:type="spellEnd"/>
+      <w:r>
+        <w:rPr>
+          <w:szCs w:val="32"/>
+        </w:rPr>
+        <w:t>&gt;</w:t>
+      </w:r>
+    </w:p>
+    <w:p>
+      <w:pPr>
+        <w:tabs>
+          <w:tab w:val="left" w:pos="1260"/>
+        </w:tabs>
+        <w:rPr>
+          <w:szCs w:val="32"/>
+        </w:rPr>
+      </w:pPr>
+      <w:r>
+        <w:rPr>
+          <w:color w:val="FF0000"/>
+          <w:szCs w:val="32"/>
+        </w:rPr>
+        <w:t>&lt;</w:t>
+      </w:r>
+      <w:proofErr w:type="spellStart"/>
+      <w:r>
+        <w:rPr>
+          <w:color w:val="FF0000"/>
+          <w:szCs w:val="32"/>
+        </w:rPr>
+        <w:t>blockcuote</w:t>
+      </w:r>
+      <w:proofErr w:type="spellEnd"/>
+      <w:r>
+        <w:rPr>
+          <w:color w:val="FF0000"/>
+          <w:szCs w:val="32"/>
+        </w:rPr>
+        <w:t xml:space="preserve">&gt; </w:t>
+      </w:r>
+      <w:r>
+        <w:rPr>
+          <w:szCs w:val="32"/>
+        </w:rPr>
+        <w:t>Marca una cita de texto</w:t>
+      </w:r>
+    </w:p>
+    <w:p>
+      <w:pPr>
+        <w:tabs>
+          <w:tab w:val="left" w:pos="1260"/>
+        </w:tabs>
+        <w:rPr>
+          <w:szCs w:val="32"/>
+        </w:rPr>
+      </w:pPr>
+      <w:r>
+        <w:rPr>
+          <w:color w:val="FF0000"/>
+          <w:szCs w:val="32"/>
+        </w:rPr>
+        <w:t>&lt;</w:t>
+      </w:r>
+      <w:proofErr w:type="spellStart"/>
+      <w:r>
+        <w:rPr>
+          <w:color w:val="FF0000"/>
+          <w:szCs w:val="32"/>
+        </w:rPr>
+        <w:t>address</w:t>
+      </w:r>
+      <w:proofErr w:type="spellEnd"/>
+      <w:r>
+        <w:rPr>
+          <w:color w:val="FF0000"/>
+          <w:szCs w:val="32"/>
+        </w:rPr>
+        <w:t xml:space="preserve">&gt; </w:t>
+      </w:r>
+      <w:r>
+        <w:rPr>
+          <w:szCs w:val="32"/>
+        </w:rPr>
+        <w:t>Marca una dirección</w:t>
+      </w:r>
+    </w:p>
+    <w:p>
+      <w:pPr>
+        <w:tabs>
+          <w:tab w:val="left" w:pos="1260"/>
+        </w:tabs>
+        <w:rPr>
+          <w:szCs w:val="32"/>
+        </w:rPr>
+      </w:pPr>
+      <w:r>
+        <w:rPr>
+          <w:color w:val="FF0000"/>
+          <w:szCs w:val="32"/>
+        </w:rPr>
+        <w:t xml:space="preserve">&lt;time </w:t>
+      </w:r>
+      <w:proofErr w:type="spellStart"/>
+      <w:r>
+        <w:rPr>
+          <w:color w:val="FF0000"/>
+          <w:szCs w:val="32"/>
+        </w:rPr>
+        <w:t>datetime</w:t>
+      </w:r>
+      <w:proofErr w:type="spellEnd"/>
+      <w:proofErr w:type="gramStart"/>
+      <w:r>
+        <w:rPr>
+          <w:color w:val="FF0000"/>
+          <w:szCs w:val="32"/>
+        </w:rPr>
+        <w:t>=”</w:t>
+      </w:r>
+      <w:proofErr w:type="spellStart"/>
+      <w:r>
+        <w:rPr>
+          <w:color w:val="FF0000"/>
+          <w:szCs w:val="32"/>
+        </w:rPr>
+        <w:t>yyyy</w:t>
+      </w:r>
+      <w:proofErr w:type="spellEnd"/>
+      <w:proofErr w:type="gramEnd"/>
+      <w:r>
+        <w:rPr>
+          <w:color w:val="FF0000"/>
+          <w:szCs w:val="32"/>
+        </w:rPr>
+        <w:t>-mm-</w:t>
+      </w:r>
+      <w:proofErr w:type="spellStart"/>
+      <w:r>
+        <w:rPr>
+          <w:color w:val="FF0000"/>
+          <w:szCs w:val="32"/>
+        </w:rPr>
+        <w:t>dd</w:t>
+      </w:r>
+      <w:proofErr w:type="spellEnd"/>
+      <w:r>
+        <w:rPr>
+          <w:color w:val="FF0000"/>
+          <w:szCs w:val="32"/>
+        </w:rPr>
+        <w:t xml:space="preserve"> </w:t>
+      </w:r>
+      <w:proofErr w:type="spellStart"/>
+      <w:r>
+        <w:rPr>
+          <w:color w:val="FF0000"/>
+          <w:szCs w:val="32"/>
+        </w:rPr>
+        <w:t>hh:mm:ss</w:t>
+      </w:r>
+      <w:proofErr w:type="spellEnd"/>
+      <w:r>
+        <w:rPr>
+          <w:color w:val="FF0000"/>
+          <w:szCs w:val="32"/>
+        </w:rPr>
+        <w:t xml:space="preserve">&gt;  </w:t>
+      </w:r>
+      <w:r>
+        <w:rPr>
+          <w:szCs w:val="32"/>
+        </w:rPr>
+        <w:t>Marca una fecha</w:t>
+      </w:r>
+    </w:p>
+    <w:p>
+      <w:pPr>
+        <w:tabs>
+          <w:tab w:val="left" w:pos="1260"/>
+        </w:tabs>
+        <w:rPr>
+          <w:szCs w:val="32"/>
+        </w:rPr>
+      </w:pPr>
+      <w:r>
+        <w:rPr>
+          <w:color w:val="FF0000"/>
+          <w:szCs w:val="32"/>
+        </w:rPr>
+        <w:t>&lt;</w:t>
+      </w:r>
+      <w:proofErr w:type="spellStart"/>
+      <w:r>
+        <w:rPr>
+          <w:color w:val="FF0000"/>
+          <w:szCs w:val="32"/>
+        </w:rPr>
+        <w:t>hr</w:t>
+      </w:r>
+      <w:proofErr w:type="spellEnd"/>
+      <w:r>
+        <w:rPr>
+          <w:color w:val="FF0000"/>
+          <w:szCs w:val="32"/>
+        </w:rPr>
+        <w:t xml:space="preserve">&gt; </w:t>
+      </w:r>
+      <w:r>
+        <w:rPr>
+          <w:szCs w:val="32"/>
+        </w:rPr>
+        <w:t xml:space="preserve">Horizontal </w:t>
+      </w:r>
+      <w:proofErr w:type="spellStart"/>
+      <w:r>
+        <w:rPr>
+          <w:szCs w:val="32"/>
+        </w:rPr>
+        <w:t>ruler</w:t>
+      </w:r>
+      <w:proofErr w:type="spellEnd"/>
     </w:p>
     <w:p>
       <w:pPr>

</xml_diff>